<commit_message>
Tema 2 tanecik modelleri uzay dolgu modelleriyle yenilendi, kalip numaralari duzeltildi
- 2.2 (N2O4/NO2), 2.8 (kuvvetli/zayif asit), 2.10 (notrallesme) sekilleri Kimya9/10 gorunumunde
  uzay dolgu modelleriyle yeniden cizildi
- 2.6 suyun otoiyonizasyonu ve 2.7 proton aktarimi icin Shutterstock kutulari yerine modeller
- Tema 2 Ornek-Cozum numaralari 2.9 ve 2.11'de kaymisti; tum tema bastan sirali numaralandi
</commit_message>
<xml_diff>
--- a/Formlar/Kullanilan_Kaliplar-tema-2.docx
+++ b/Formlar/Kullanilan_Kaliplar-tema-2.docx
@@ -2140,7 +2140,7 @@
                 <w:rFonts w:ascii="Times New Roman" w:hAnsi="Times New Roman" w:cs="Times New Roman"/>
                 <w:lang w:val="tr-TR"/>
               </w:rPr>
-              <w:t>2.1.</w:t>
+              <w:t>2.8.</w:t>
             </w:r>
           </w:p>
         </w:tc>
@@ -2232,7 +2232,7 @@
                 <w:rFonts w:ascii="Times New Roman" w:hAnsi="Times New Roman" w:cs="Times New Roman"/>
                 <w:lang w:val="tr-TR"/>
               </w:rPr>
-              <w:t>2.2.</w:t>
+              <w:t>2.9.</w:t>
             </w:r>
           </w:p>
         </w:tc>
@@ -2508,7 +2508,7 @@
                 <w:rFonts w:ascii="Times New Roman" w:hAnsi="Times New Roman" w:cs="Times New Roman"/>
                 <w:lang w:val="tr-TR"/>
               </w:rPr>
-              <w:t>2.3.</w:t>
+              <w:t>2.10.</w:t>
             </w:r>
           </w:p>
         </w:tc>
@@ -2600,7 +2600,7 @@
                 <w:rFonts w:ascii="Times New Roman" w:hAnsi="Times New Roman" w:cs="Times New Roman"/>
                 <w:lang w:val="tr-TR"/>
               </w:rPr>
-              <w:t>2.1.</w:t>
+              <w:t>2.2.</w:t>
             </w:r>
           </w:p>
         </w:tc>
@@ -2876,7 +2876,7 @@
                 <w:rFonts w:ascii="Times New Roman" w:hAnsi="Times New Roman" w:cs="Times New Roman"/>
                 <w:lang w:val="tr-TR"/>
               </w:rPr>
-              <w:t>2.4.</w:t>
+              <w:t>2.11.</w:t>
             </w:r>
           </w:p>
         </w:tc>
@@ -3152,7 +3152,7 @@
                 <w:rFonts w:ascii="Times New Roman" w:hAnsi="Times New Roman" w:cs="Times New Roman"/>
                 <w:lang w:val="tr-TR"/>
               </w:rPr>
-              <w:t>2.5.</w:t>
+              <w:t>2.12.</w:t>
             </w:r>
           </w:p>
         </w:tc>
@@ -3244,7 +3244,7 @@
                 <w:rFonts w:ascii="Times New Roman" w:hAnsi="Times New Roman" w:cs="Times New Roman"/>
                 <w:lang w:val="tr-TR"/>
               </w:rPr>
-              <w:t>2.6.</w:t>
+              <w:t>2.13.</w:t>
             </w:r>
           </w:p>
         </w:tc>
@@ -3336,7 +3336,7 @@
                 <w:rFonts w:ascii="Times New Roman" w:hAnsi="Times New Roman" w:cs="Times New Roman"/>
                 <w:lang w:val="tr-TR"/>
               </w:rPr>
-              <w:t>2.7.</w:t>
+              <w:t>2.14.</w:t>
             </w:r>
           </w:p>
         </w:tc>
@@ -3428,7 +3428,7 @@
                 <w:rFonts w:ascii="Times New Roman" w:hAnsi="Times New Roman" w:cs="Times New Roman"/>
                 <w:lang w:val="tr-TR"/>
               </w:rPr>
-              <w:t>2.8.</w:t>
+              <w:t>2.15.</w:t>
             </w:r>
           </w:p>
         </w:tc>
@@ -3520,7 +3520,7 @@
                 <w:rFonts w:ascii="Times New Roman" w:hAnsi="Times New Roman" w:cs="Times New Roman"/>
                 <w:lang w:val="tr-TR"/>
               </w:rPr>
-              <w:t>2.9.</w:t>
+              <w:t>2.16.</w:t>
             </w:r>
           </w:p>
         </w:tc>
@@ -4256,7 +4256,7 @@
                 <w:rFonts w:ascii="Times New Roman" w:hAnsi="Times New Roman" w:cs="Times New Roman"/>
                 <w:lang w:val="tr-TR"/>
               </w:rPr>
-              <w:t>2.1.</w:t>
+              <w:t>2.20.</w:t>
             </w:r>
           </w:p>
         </w:tc>
@@ -4348,7 +4348,7 @@
                 <w:rFonts w:ascii="Times New Roman" w:hAnsi="Times New Roman" w:cs="Times New Roman"/>
                 <w:lang w:val="tr-TR"/>
               </w:rPr>
-              <w:t>2.2.</w:t>
+              <w:t>2.21.</w:t>
             </w:r>
           </w:p>
         </w:tc>
@@ -4440,7 +4440,7 @@
                 <w:rFonts w:ascii="Times New Roman" w:hAnsi="Times New Roman" w:cs="Times New Roman"/>
                 <w:lang w:val="tr-TR"/>
               </w:rPr>
-              <w:t>2.1.</w:t>
+              <w:t>2.3.</w:t>
             </w:r>
           </w:p>
         </w:tc>

</xml_diff>

<commit_message>
Tema 2 ve 3 bolum girisleri: bolum kapagi gorseli, genisletilmis giris metinleri, Asit-Baz ve Cozunurluk bolumlerine Dusun Hatirla ve Hazirlan eklendi
</commit_message>
<xml_diff>
--- a/Formlar/Kullanilan_Kaliplar-tema-2.docx
+++ b/Formlar/Kullanilan_Kaliplar-tema-2.docx
@@ -2026,7 +2026,7 @@
                 <w:rFonts w:ascii="Times New Roman" w:hAnsi="Times New Roman" w:cs="Times New Roman"/>
                 <w:lang w:val="tr-TR"/>
               </w:rPr>
-              <w:t>Analiz ve Keşif Atölyesi</w:t>
+              <w:t>Düşün, Hatırla ve Hazırlan!</w:t>
             </w:r>
           </w:p>
         </w:tc>
@@ -2048,7 +2048,7 @@
                 <w:rFonts w:ascii="Times New Roman" w:hAnsi="Times New Roman" w:cs="Times New Roman"/>
                 <w:lang w:val="tr-TR"/>
               </w:rPr>
-              <w:t>2.6.</w:t>
+              <w:t>2.2.</w:t>
             </w:r>
           </w:p>
         </w:tc>
@@ -2070,7 +2070,7 @@
                 <w:rFonts w:ascii="Times New Roman" w:hAnsi="Times New Roman" w:cs="Times New Roman"/>
                 <w:lang w:val="tr-TR"/>
               </w:rPr>
-              <w:t>Kim11.2.6 / 2.2.1. Saf Suyun Otoiyonizasyonu</w:t>
+              <w:t xml:space="preserve">Kim11.2.6 / </w:t>
             </w:r>
             <w:proofErr w:type="spellStart"/>
             <w:proofErr w:type="spellEnd"/>
@@ -2118,7 +2118,7 @@
                 <w:rFonts w:ascii="Times New Roman" w:hAnsi="Times New Roman" w:cs="Times New Roman"/>
                 <w:lang w:val="tr-TR"/>
               </w:rPr>
-              <w:t>Örnek-Çözüm Atölyesi</w:t>
+              <w:t>Analiz ve Keşif Atölyesi</w:t>
             </w:r>
           </w:p>
         </w:tc>
@@ -2140,7 +2140,7 @@
                 <w:rFonts w:ascii="Times New Roman" w:hAnsi="Times New Roman" w:cs="Times New Roman"/>
                 <w:lang w:val="tr-TR"/>
               </w:rPr>
-              <w:t>2.8.</w:t>
+              <w:t>2.6.</w:t>
             </w:r>
           </w:p>
         </w:tc>
@@ -2232,7 +2232,7 @@
                 <w:rFonts w:ascii="Times New Roman" w:hAnsi="Times New Roman" w:cs="Times New Roman"/>
                 <w:lang w:val="tr-TR"/>
               </w:rPr>
-              <w:t>2.9.</w:t>
+              <w:t>2.8.</w:t>
             </w:r>
           </w:p>
         </w:tc>
@@ -2302,7 +2302,7 @@
                 <w:rFonts w:ascii="Times New Roman" w:hAnsi="Times New Roman" w:cs="Times New Roman"/>
                 <w:lang w:val="tr-TR"/>
               </w:rPr>
-              <w:t>Sıra Sizde</w:t>
+              <w:t>Örnek-Çözüm Atölyesi</w:t>
             </w:r>
           </w:p>
         </w:tc>
@@ -2324,7 +2324,7 @@
                 <w:rFonts w:ascii="Times New Roman" w:hAnsi="Times New Roman" w:cs="Times New Roman"/>
                 <w:lang w:val="tr-TR"/>
               </w:rPr>
-              <w:t>2.6.</w:t>
+              <w:t>2.9.</w:t>
             </w:r>
           </w:p>
         </w:tc>
@@ -2394,7 +2394,7 @@
                 <w:rFonts w:ascii="Times New Roman" w:hAnsi="Times New Roman" w:cs="Times New Roman"/>
                 <w:lang w:val="tr-TR"/>
               </w:rPr>
-              <w:t>Analiz ve Keşif Atölyesi</w:t>
+              <w:t>Sıra Sizde</w:t>
             </w:r>
           </w:p>
         </w:tc>
@@ -2416,7 +2416,7 @@
                 <w:rFonts w:ascii="Times New Roman" w:hAnsi="Times New Roman" w:cs="Times New Roman"/>
                 <w:lang w:val="tr-TR"/>
               </w:rPr>
-              <w:t>2.7.</w:t>
+              <w:t>2.6.</w:t>
             </w:r>
           </w:p>
         </w:tc>
@@ -2438,7 +2438,7 @@
                 <w:rFonts w:ascii="Times New Roman" w:hAnsi="Times New Roman" w:cs="Times New Roman"/>
                 <w:lang w:val="tr-TR"/>
               </w:rPr>
-              <w:t>Kim11.2.7 / 2.2.2. Asit-Baz Teorilerinin Karşılaştırılması</w:t>
+              <w:t>Kim11.2.6 / 2.2.1. Saf Suyun Otoiyonizasyonu</w:t>
             </w:r>
             <w:proofErr w:type="spellStart"/>
             <w:proofErr w:type="spellEnd"/>
@@ -2486,7 +2486,7 @@
                 <w:rFonts w:ascii="Times New Roman" w:hAnsi="Times New Roman" w:cs="Times New Roman"/>
                 <w:lang w:val="tr-TR"/>
               </w:rPr>
-              <w:t>Örnek-Çözüm Atölyesi</w:t>
+              <w:t>Analiz ve Keşif Atölyesi</w:t>
             </w:r>
           </w:p>
         </w:tc>
@@ -2508,7 +2508,7 @@
                 <w:rFonts w:ascii="Times New Roman" w:hAnsi="Times New Roman" w:cs="Times New Roman"/>
                 <w:lang w:val="tr-TR"/>
               </w:rPr>
-              <w:t>2.10.</w:t>
+              <w:t>2.7.</w:t>
             </w:r>
           </w:p>
         </w:tc>
@@ -2578,7 +2578,7 @@
                 <w:rFonts w:ascii="Times New Roman" w:hAnsi="Times New Roman" w:cs="Times New Roman"/>
                 <w:lang w:val="tr-TR"/>
               </w:rPr>
-              <w:t>Bilgi Köşesi</w:t>
+              <w:t>Örnek-Çözüm Atölyesi</w:t>
             </w:r>
           </w:p>
         </w:tc>
@@ -2600,7 +2600,7 @@
                 <w:rFonts w:ascii="Times New Roman" w:hAnsi="Times New Roman" w:cs="Times New Roman"/>
                 <w:lang w:val="tr-TR"/>
               </w:rPr>
-              <w:t>2.2.</w:t>
+              <w:t>2.10.</w:t>
             </w:r>
           </w:p>
         </w:tc>
@@ -2670,7 +2670,7 @@
                 <w:rFonts w:ascii="Times New Roman" w:hAnsi="Times New Roman" w:cs="Times New Roman"/>
                 <w:lang w:val="tr-TR"/>
               </w:rPr>
-              <w:t>Sıra Sizde</w:t>
+              <w:t>Bilgi Köşesi</w:t>
             </w:r>
           </w:p>
         </w:tc>
@@ -2692,7 +2692,7 @@
                 <w:rFonts w:ascii="Times New Roman" w:hAnsi="Times New Roman" w:cs="Times New Roman"/>
                 <w:lang w:val="tr-TR"/>
               </w:rPr>
-              <w:t>2.7.</w:t>
+              <w:t>2.2.</w:t>
             </w:r>
           </w:p>
         </w:tc>
@@ -2762,7 +2762,7 @@
                 <w:rFonts w:ascii="Times New Roman" w:hAnsi="Times New Roman" w:cs="Times New Roman"/>
                 <w:lang w:val="tr-TR"/>
               </w:rPr>
-              <w:t>Analiz ve Keşif Atölyesi</w:t>
+              <w:t>Sıra Sizde</w:t>
             </w:r>
           </w:p>
         </w:tc>
@@ -2784,7 +2784,7 @@
                 <w:rFonts w:ascii="Times New Roman" w:hAnsi="Times New Roman" w:cs="Times New Roman"/>
                 <w:lang w:val="tr-TR"/>
               </w:rPr>
-              <w:t>2.8.</w:t>
+              <w:t>2.7.</w:t>
             </w:r>
           </w:p>
         </w:tc>
@@ -2806,7 +2806,7 @@
                 <w:rFonts w:ascii="Times New Roman" w:hAnsi="Times New Roman" w:cs="Times New Roman"/>
                 <w:lang w:val="tr-TR"/>
               </w:rPr>
-              <w:t>Kim11.2.8 / 2.2.3. Asitlerin ve Bazların Kuvveti</w:t>
+              <w:t>Kim11.2.7 / 2.2.2. Asit-Baz Teorilerinin Karşılaştırılması</w:t>
             </w:r>
             <w:proofErr w:type="spellStart"/>
             <w:proofErr w:type="spellEnd"/>
@@ -2854,7 +2854,7 @@
                 <w:rFonts w:ascii="Times New Roman" w:hAnsi="Times New Roman" w:cs="Times New Roman"/>
                 <w:lang w:val="tr-TR"/>
               </w:rPr>
-              <w:t>Örnek-Çözüm Atölyesi</w:t>
+              <w:t>Analiz ve Keşif Atölyesi</w:t>
             </w:r>
           </w:p>
         </w:tc>
@@ -2876,7 +2876,7 @@
                 <w:rFonts w:ascii="Times New Roman" w:hAnsi="Times New Roman" w:cs="Times New Roman"/>
                 <w:lang w:val="tr-TR"/>
               </w:rPr>
-              <w:t>2.11.</w:t>
+              <w:t>2.8.</w:t>
             </w:r>
           </w:p>
         </w:tc>
@@ -2946,7 +2946,7 @@
                 <w:rFonts w:ascii="Times New Roman" w:hAnsi="Times New Roman" w:cs="Times New Roman"/>
                 <w:lang w:val="tr-TR"/>
               </w:rPr>
-              <w:t>Sıra Sizde</w:t>
+              <w:t>Örnek-Çözüm Atölyesi</w:t>
             </w:r>
           </w:p>
         </w:tc>
@@ -2968,7 +2968,7 @@
                 <w:rFonts w:ascii="Times New Roman" w:hAnsi="Times New Roman" w:cs="Times New Roman"/>
                 <w:lang w:val="tr-TR"/>
               </w:rPr>
-              <w:t>2.8.</w:t>
+              <w:t>2.11.</w:t>
             </w:r>
           </w:p>
         </w:tc>
@@ -3038,7 +3038,7 @@
                 <w:rFonts w:ascii="Times New Roman" w:hAnsi="Times New Roman" w:cs="Times New Roman"/>
                 <w:lang w:val="tr-TR"/>
               </w:rPr>
-              <w:t>Analiz ve Keşif Atölyesi</w:t>
+              <w:t>Sıra Sizde</w:t>
             </w:r>
           </w:p>
         </w:tc>
@@ -3060,7 +3060,7 @@
                 <w:rFonts w:ascii="Times New Roman" w:hAnsi="Times New Roman" w:cs="Times New Roman"/>
                 <w:lang w:val="tr-TR"/>
               </w:rPr>
-              <w:t>2.9.</w:t>
+              <w:t>2.8.</w:t>
             </w:r>
           </w:p>
         </w:tc>
@@ -3082,7 +3082,7 @@
                 <w:rFonts w:ascii="Times New Roman" w:hAnsi="Times New Roman" w:cs="Times New Roman"/>
                 <w:lang w:val="tr-TR"/>
               </w:rPr>
-              <w:t>Kim11.2.9 / 2.2.4. Kuvvetli Asit-Zayıf Asit ve Kuvvetli Baz-Zayıf Baz Sulu Çözeltilerindeki pH Hesaplamaları</w:t>
+              <w:t>Kim11.2.8 / 2.2.3. Asitlerin ve Bazların Kuvveti</w:t>
             </w:r>
             <w:proofErr w:type="spellStart"/>
             <w:proofErr w:type="spellEnd"/>
@@ -3130,7 +3130,7 @@
                 <w:rFonts w:ascii="Times New Roman" w:hAnsi="Times New Roman" w:cs="Times New Roman"/>
                 <w:lang w:val="tr-TR"/>
               </w:rPr>
-              <w:t>Örnek-Çözüm Atölyesi</w:t>
+              <w:t>Analiz ve Keşif Atölyesi</w:t>
             </w:r>
           </w:p>
         </w:tc>
@@ -3152,7 +3152,7 @@
                 <w:rFonts w:ascii="Times New Roman" w:hAnsi="Times New Roman" w:cs="Times New Roman"/>
                 <w:lang w:val="tr-TR"/>
               </w:rPr>
-              <w:t>2.12.</w:t>
+              <w:t>2.9.</w:t>
             </w:r>
           </w:p>
         </w:tc>
@@ -3244,7 +3244,7 @@
                 <w:rFonts w:ascii="Times New Roman" w:hAnsi="Times New Roman" w:cs="Times New Roman"/>
                 <w:lang w:val="tr-TR"/>
               </w:rPr>
-              <w:t>2.13.</w:t>
+              <w:t>2.12.</w:t>
             </w:r>
           </w:p>
         </w:tc>
@@ -3336,7 +3336,7 @@
                 <w:rFonts w:ascii="Times New Roman" w:hAnsi="Times New Roman" w:cs="Times New Roman"/>
                 <w:lang w:val="tr-TR"/>
               </w:rPr>
-              <w:t>2.14.</w:t>
+              <w:t>2.13.</w:t>
             </w:r>
           </w:p>
         </w:tc>
@@ -3428,7 +3428,7 @@
                 <w:rFonts w:ascii="Times New Roman" w:hAnsi="Times New Roman" w:cs="Times New Roman"/>
                 <w:lang w:val="tr-TR"/>
               </w:rPr>
-              <w:t>2.15.</w:t>
+              <w:t>2.14.</w:t>
             </w:r>
           </w:p>
         </w:tc>
@@ -3520,7 +3520,7 @@
                 <w:rFonts w:ascii="Times New Roman" w:hAnsi="Times New Roman" w:cs="Times New Roman"/>
                 <w:lang w:val="tr-TR"/>
               </w:rPr>
-              <w:t>2.16.</w:t>
+              <w:t>2.15.</w:t>
             </w:r>
           </w:p>
         </w:tc>
@@ -3590,7 +3590,7 @@
                 <w:rFonts w:ascii="Times New Roman" w:hAnsi="Times New Roman" w:cs="Times New Roman"/>
                 <w:lang w:val="tr-TR"/>
               </w:rPr>
-              <w:t>Sıra Sizde</w:t>
+              <w:t>Örnek-Çözüm Atölyesi</w:t>
             </w:r>
           </w:p>
         </w:tc>
@@ -3612,7 +3612,7 @@
                 <w:rFonts w:ascii="Times New Roman" w:hAnsi="Times New Roman" w:cs="Times New Roman"/>
                 <w:lang w:val="tr-TR"/>
               </w:rPr>
-              <w:t>2.9.</w:t>
+              <w:t>2.16.</w:t>
             </w:r>
           </w:p>
         </w:tc>
@@ -3682,7 +3682,7 @@
                 <w:rFonts w:ascii="Times New Roman" w:hAnsi="Times New Roman" w:cs="Times New Roman"/>
                 <w:lang w:val="tr-TR"/>
               </w:rPr>
-              <w:t>Analiz ve Keşif Atölyesi</w:t>
+              <w:t>Sıra Sizde</w:t>
             </w:r>
           </w:p>
         </w:tc>
@@ -3704,7 +3704,7 @@
                 <w:rFonts w:ascii="Times New Roman" w:hAnsi="Times New Roman" w:cs="Times New Roman"/>
                 <w:lang w:val="tr-TR"/>
               </w:rPr>
-              <w:t>2.10.</w:t>
+              <w:t>2.9.</w:t>
             </w:r>
           </w:p>
         </w:tc>
@@ -3726,7 +3726,7 @@
                 <w:rFonts w:ascii="Times New Roman" w:hAnsi="Times New Roman" w:cs="Times New Roman"/>
                 <w:lang w:val="tr-TR"/>
               </w:rPr>
-              <w:t>Kim11.2.10 / 2.2.5. Kuvvetli Asit ve Kuvvetli Bazların Nötralleşme Tepkimeleri</w:t>
+              <w:t>Kim11.2.9 / 2.2.4. Kuvvetli Asit-Zayıf Asit ve Kuvvetli Baz-Zayıf Baz Sulu Çözeltilerindeki pH Hesaplamaları</w:t>
             </w:r>
             <w:proofErr w:type="spellStart"/>
             <w:proofErr w:type="spellEnd"/>
@@ -3774,7 +3774,7 @@
                 <w:rFonts w:ascii="Times New Roman" w:hAnsi="Times New Roman" w:cs="Times New Roman"/>
                 <w:lang w:val="tr-TR"/>
               </w:rPr>
-              <w:t>Örnek-Çözüm Atölyesi</w:t>
+              <w:t>Analiz ve Keşif Atölyesi</w:t>
             </w:r>
           </w:p>
         </w:tc>
@@ -3796,7 +3796,7 @@
                 <w:rFonts w:ascii="Times New Roman" w:hAnsi="Times New Roman" w:cs="Times New Roman"/>
                 <w:lang w:val="tr-TR"/>
               </w:rPr>
-              <w:t>2.17.</w:t>
+              <w:t>2.10.</w:t>
             </w:r>
           </w:p>
         </w:tc>
@@ -3888,7 +3888,7 @@
                 <w:rFonts w:ascii="Times New Roman" w:hAnsi="Times New Roman" w:cs="Times New Roman"/>
                 <w:lang w:val="tr-TR"/>
               </w:rPr>
-              <w:t>2.18.</w:t>
+              <w:t>2.17.</w:t>
             </w:r>
           </w:p>
         </w:tc>
@@ -3980,7 +3980,7 @@
                 <w:rFonts w:ascii="Times New Roman" w:hAnsi="Times New Roman" w:cs="Times New Roman"/>
                 <w:lang w:val="tr-TR"/>
               </w:rPr>
-              <w:t>2.19.</w:t>
+              <w:t>2.18.</w:t>
             </w:r>
           </w:p>
         </w:tc>
@@ -4050,7 +4050,7 @@
                 <w:rFonts w:ascii="Times New Roman" w:hAnsi="Times New Roman" w:cs="Times New Roman"/>
                 <w:lang w:val="tr-TR"/>
               </w:rPr>
-              <w:t>Sıra Sizde</w:t>
+              <w:t>Örnek-Çözüm Atölyesi</w:t>
             </w:r>
           </w:p>
         </w:tc>
@@ -4072,7 +4072,7 @@
                 <w:rFonts w:ascii="Times New Roman" w:hAnsi="Times New Roman" w:cs="Times New Roman"/>
                 <w:lang w:val="tr-TR"/>
               </w:rPr>
-              <w:t>2.10.</w:t>
+              <w:t>2.19.</w:t>
             </w:r>
           </w:p>
         </w:tc>
@@ -4142,7 +4142,7 @@
                 <w:rFonts w:ascii="Times New Roman" w:hAnsi="Times New Roman" w:cs="Times New Roman"/>
                 <w:lang w:val="tr-TR"/>
               </w:rPr>
-              <w:t>Analiz ve Keşif Atölyesi</w:t>
+              <w:t>Sıra Sizde</w:t>
             </w:r>
           </w:p>
         </w:tc>
@@ -4164,7 +4164,7 @@
                 <w:rFonts w:ascii="Times New Roman" w:hAnsi="Times New Roman" w:cs="Times New Roman"/>
                 <w:lang w:val="tr-TR"/>
               </w:rPr>
-              <w:t>2.11.</w:t>
+              <w:t>2.10.</w:t>
             </w:r>
           </w:p>
         </w:tc>
@@ -4186,7 +4186,7 @@
                 <w:rFonts w:ascii="Times New Roman" w:hAnsi="Times New Roman" w:cs="Times New Roman"/>
                 <w:lang w:val="tr-TR"/>
               </w:rPr>
-              <w:t>Kim11.2.11 / 2.2.6. Kuvvetli Asit-Kuvvetli Baz Titrasyonları</w:t>
+              <w:t>Kim11.2.10 / 2.2.5. Kuvvetli Asit ve Kuvvetli Bazların Nötralleşme Tepkimeleri</w:t>
             </w:r>
             <w:proofErr w:type="spellStart"/>
             <w:proofErr w:type="spellEnd"/>
@@ -4234,7 +4234,7 @@
                 <w:rFonts w:ascii="Times New Roman" w:hAnsi="Times New Roman" w:cs="Times New Roman"/>
                 <w:lang w:val="tr-TR"/>
               </w:rPr>
-              <w:t>Örnek-Çözüm Atölyesi</w:t>
+              <w:t>Analiz ve Keşif Atölyesi</w:t>
             </w:r>
           </w:p>
         </w:tc>
@@ -4256,7 +4256,7 @@
                 <w:rFonts w:ascii="Times New Roman" w:hAnsi="Times New Roman" w:cs="Times New Roman"/>
                 <w:lang w:val="tr-TR"/>
               </w:rPr>
-              <w:t>2.20.</w:t>
+              <w:t>2.11.</w:t>
             </w:r>
           </w:p>
         </w:tc>
@@ -4348,7 +4348,7 @@
                 <w:rFonts w:ascii="Times New Roman" w:hAnsi="Times New Roman" w:cs="Times New Roman"/>
                 <w:lang w:val="tr-TR"/>
               </w:rPr>
-              <w:t>2.21.</w:t>
+              <w:t>2.20.</w:t>
             </w:r>
           </w:p>
         </w:tc>
@@ -4418,7 +4418,7 @@
                 <w:rFonts w:ascii="Times New Roman" w:hAnsi="Times New Roman" w:cs="Times New Roman"/>
                 <w:lang w:val="tr-TR"/>
               </w:rPr>
-              <w:t>Bilgi Köşesi</w:t>
+              <w:t>Örnek-Çözüm Atölyesi</w:t>
             </w:r>
           </w:p>
         </w:tc>
@@ -4440,7 +4440,7 @@
                 <w:rFonts w:ascii="Times New Roman" w:hAnsi="Times New Roman" w:cs="Times New Roman"/>
                 <w:lang w:val="tr-TR"/>
               </w:rPr>
-              <w:t>2.3.</w:t>
+              <w:t>2.21.</w:t>
             </w:r>
           </w:p>
         </w:tc>
@@ -4510,7 +4510,7 @@
                 <w:rFonts w:ascii="Times New Roman" w:hAnsi="Times New Roman" w:cs="Times New Roman"/>
                 <w:lang w:val="tr-TR"/>
               </w:rPr>
-              <w:t>Sıra Sizde</w:t>
+              <w:t>Bilgi Köşesi</w:t>
             </w:r>
           </w:p>
         </w:tc>
@@ -4532,7 +4532,7 @@
                 <w:rFonts w:ascii="Times New Roman" w:hAnsi="Times New Roman" w:cs="Times New Roman"/>
                 <w:lang w:val="tr-TR"/>
               </w:rPr>
-              <w:t>2.11.</w:t>
+              <w:t>2.3.</w:t>
             </w:r>
           </w:p>
         </w:tc>
@@ -4602,7 +4602,7 @@
                 <w:rFonts w:ascii="Times New Roman" w:hAnsi="Times New Roman" w:cs="Times New Roman"/>
                 <w:lang w:val="tr-TR"/>
               </w:rPr>
-              <w:t>Analiz ve Keşif Atölyesi</w:t>
+              <w:t>Sıra Sizde</w:t>
             </w:r>
           </w:p>
         </w:tc>
@@ -4624,7 +4624,7 @@
                 <w:rFonts w:ascii="Times New Roman" w:hAnsi="Times New Roman" w:cs="Times New Roman"/>
                 <w:lang w:val="tr-TR"/>
               </w:rPr>
-              <w:t>2.12.</w:t>
+              <w:t>2.11.</w:t>
             </w:r>
           </w:p>
         </w:tc>
@@ -4646,7 +4646,7 @@
                 <w:rFonts w:ascii="Times New Roman" w:hAnsi="Times New Roman" w:cs="Times New Roman"/>
                 <w:lang w:val="tr-TR"/>
               </w:rPr>
-              <w:t>Kim11.2.12 / 2.2.7. Asidik ve Bazik Ürünlerin Seçiminde Dikkat Edilmesi Gerekenler</w:t>
+              <w:t>Kim11.2.11 / 2.2.6. Kuvvetli Asit-Kuvvetli Baz Titrasyonları</w:t>
             </w:r>
             <w:proofErr w:type="spellStart"/>
             <w:proofErr w:type="spellEnd"/>
@@ -4694,7 +4694,7 @@
                 <w:rFonts w:ascii="Times New Roman" w:hAnsi="Times New Roman" w:cs="Times New Roman"/>
                 <w:lang w:val="tr-TR"/>
               </w:rPr>
-              <w:t>Örnek-Çözüm Atölyesi</w:t>
+              <w:t>Analiz ve Keşif Atölyesi</w:t>
             </w:r>
           </w:p>
         </w:tc>
@@ -4716,7 +4716,7 @@
                 <w:rFonts w:ascii="Times New Roman" w:hAnsi="Times New Roman" w:cs="Times New Roman"/>
                 <w:lang w:val="tr-TR"/>
               </w:rPr>
-              <w:t>2.22.</w:t>
+              <w:t>2.12.</w:t>
             </w:r>
           </w:p>
         </w:tc>
@@ -4786,7 +4786,7 @@
                 <w:rFonts w:ascii="Times New Roman" w:hAnsi="Times New Roman" w:cs="Times New Roman"/>
                 <w:lang w:val="tr-TR"/>
               </w:rPr>
-              <w:t>Tartışma ve Paylaşım Atölyesi</w:t>
+              <w:t>Örnek-Çözüm Atölyesi</w:t>
             </w:r>
           </w:p>
         </w:tc>
@@ -4808,7 +4808,7 @@
                 <w:rFonts w:ascii="Times New Roman" w:hAnsi="Times New Roman" w:cs="Times New Roman"/>
                 <w:lang w:val="tr-TR"/>
               </w:rPr>
-              <w:t>2.1.</w:t>
+              <w:t>2.22.</w:t>
             </w:r>
           </w:p>
         </w:tc>
@@ -4878,6 +4878,98 @@
                 <w:rFonts w:ascii="Times New Roman" w:hAnsi="Times New Roman" w:cs="Times New Roman"/>
                 <w:lang w:val="tr-TR"/>
               </w:rPr>
+              <w:t>Tartışma ve Paylaşım Atölyesi</w:t>
+            </w:r>
+          </w:p>
+        </w:tc>
+        <w:tc>
+          <w:tcPr>
+            <w:tcW w:w="1086" w:type="dxa"/>
+            <w:shd w:val="clear" w:color="auto" w:fill="D86DCB" w:themeFill="accent5" w:themeFillTint="99"/>
+          </w:tcPr>
+          <w:p>
+            <w:pPr>
+              <w:jc w:val="both"/>
+              <w:rPr>
+                <w:rFonts w:ascii="Times New Roman" w:hAnsi="Times New Roman" w:cs="Times New Roman"/>
+                <w:lang w:val="tr-TR"/>
+              </w:rPr>
+            </w:pPr>
+            <w:r>
+              <w:rPr>
+                <w:rFonts w:ascii="Times New Roman" w:hAnsi="Times New Roman" w:cs="Times New Roman"/>
+                <w:lang w:val="tr-TR"/>
+              </w:rPr>
+              <w:t>2.1.</w:t>
+            </w:r>
+          </w:p>
+        </w:tc>
+        <w:tc>
+          <w:tcPr>
+            <w:tcW w:w="5527" w:type="dxa"/>
+            <w:shd w:val="clear" w:color="auto" w:fill="D86DCB" w:themeFill="accent5" w:themeFillTint="99"/>
+          </w:tcPr>
+          <w:p>
+            <w:pPr>
+              <w:jc w:val="both"/>
+              <w:rPr>
+                <w:rFonts w:ascii="Times New Roman" w:hAnsi="Times New Roman" w:cs="Times New Roman"/>
+                <w:lang w:val="tr-TR"/>
+              </w:rPr>
+            </w:pPr>
+            <w:r>
+              <w:rPr>
+                <w:rFonts w:ascii="Times New Roman" w:hAnsi="Times New Roman" w:cs="Times New Roman"/>
+                <w:lang w:val="tr-TR"/>
+              </w:rPr>
+              <w:t>Kim11.2.12 / 2.2.7. Asidik ve Bazik Ürünlerin Seçiminde Dikkat Edilmesi Gerekenler</w:t>
+            </w:r>
+            <w:proofErr w:type="spellStart"/>
+            <w:proofErr w:type="spellEnd"/>
+          </w:p>
+        </w:tc>
+      </w:tr>
+      <w:tr>
+        <w:tc>
+          <w:tcPr>
+            <w:tcW w:w="1081" w:type="dxa"/>
+            <w:shd w:val="clear" w:color="auto" w:fill="92D050"/>
+          </w:tcPr>
+          <w:p>
+            <w:pPr>
+              <w:jc w:val="both"/>
+              <w:rPr>
+                <w:rFonts w:ascii="Times New Roman" w:hAnsi="Times New Roman" w:cs="Times New Roman"/>
+                <w:lang w:val="tr-TR"/>
+              </w:rPr>
+            </w:pPr>
+            <w:r>
+              <w:rPr>
+                <w:rFonts w:ascii="Times New Roman" w:hAnsi="Times New Roman" w:cs="Times New Roman"/>
+                <w:lang w:val="tr-TR"/>
+              </w:rPr>
+              <w:t>Tema-2</w:t>
+            </w:r>
+          </w:p>
+        </w:tc>
+        <w:tc>
+          <w:tcPr>
+            <w:tcW w:w="1656" w:type="dxa"/>
+            <w:shd w:val="clear" w:color="auto" w:fill="D86DCB" w:themeFill="accent5" w:themeFillTint="99"/>
+          </w:tcPr>
+          <w:p>
+            <w:pPr>
+              <w:jc w:val="both"/>
+              <w:rPr>
+                <w:rFonts w:ascii="Times New Roman" w:hAnsi="Times New Roman" w:cs="Times New Roman"/>
+                <w:lang w:val="tr-TR"/>
+              </w:rPr>
+            </w:pPr>
+            <w:r>
+              <w:rPr>
+                <w:rFonts w:ascii="Times New Roman" w:hAnsi="Times New Roman" w:cs="Times New Roman"/>
+                <w:lang w:val="tr-TR"/>
+              </w:rPr>
               <w:t>Sıra Sizde</w:t>
             </w:r>
           </w:p>
@@ -4923,6 +5015,98 @@
                 <w:lang w:val="tr-TR"/>
               </w:rPr>
               <w:t>Kim11.2.12 / 2.2.7. Asidik ve Bazik Ürünlerin Seçiminde Dikkat Edilmesi Gerekenler</w:t>
+            </w:r>
+            <w:proofErr w:type="spellStart"/>
+            <w:proofErr w:type="spellEnd"/>
+          </w:p>
+        </w:tc>
+      </w:tr>
+      <w:tr>
+        <w:tc>
+          <w:tcPr>
+            <w:tcW w:w="1081" w:type="dxa"/>
+            <w:shd w:val="clear" w:color="auto" w:fill="92D050"/>
+          </w:tcPr>
+          <w:p>
+            <w:pPr>
+              <w:jc w:val="both"/>
+              <w:rPr>
+                <w:rFonts w:ascii="Times New Roman" w:hAnsi="Times New Roman" w:cs="Times New Roman"/>
+                <w:lang w:val="tr-TR"/>
+              </w:rPr>
+            </w:pPr>
+            <w:r>
+              <w:rPr>
+                <w:rFonts w:ascii="Times New Roman" w:hAnsi="Times New Roman" w:cs="Times New Roman"/>
+                <w:lang w:val="tr-TR"/>
+              </w:rPr>
+              <w:t>Tema-2</w:t>
+            </w:r>
+          </w:p>
+        </w:tc>
+        <w:tc>
+          <w:tcPr>
+            <w:tcW w:w="1656" w:type="dxa"/>
+            <w:shd w:val="clear" w:color="auto" w:fill="D86DCB" w:themeFill="accent5" w:themeFillTint="99"/>
+          </w:tcPr>
+          <w:p>
+            <w:pPr>
+              <w:jc w:val="both"/>
+              <w:rPr>
+                <w:rFonts w:ascii="Times New Roman" w:hAnsi="Times New Roman" w:cs="Times New Roman"/>
+                <w:lang w:val="tr-TR"/>
+              </w:rPr>
+            </w:pPr>
+            <w:r>
+              <w:rPr>
+                <w:rFonts w:ascii="Times New Roman" w:hAnsi="Times New Roman" w:cs="Times New Roman"/>
+                <w:lang w:val="tr-TR"/>
+              </w:rPr>
+              <w:t>Düşün, Hatırla ve Hazırlan!</w:t>
+            </w:r>
+          </w:p>
+        </w:tc>
+        <w:tc>
+          <w:tcPr>
+            <w:tcW w:w="1086" w:type="dxa"/>
+            <w:shd w:val="clear" w:color="auto" w:fill="D86DCB" w:themeFill="accent5" w:themeFillTint="99"/>
+          </w:tcPr>
+          <w:p>
+            <w:pPr>
+              <w:jc w:val="both"/>
+              <w:rPr>
+                <w:rFonts w:ascii="Times New Roman" w:hAnsi="Times New Roman" w:cs="Times New Roman"/>
+                <w:lang w:val="tr-TR"/>
+              </w:rPr>
+            </w:pPr>
+            <w:r>
+              <w:rPr>
+                <w:rFonts w:ascii="Times New Roman" w:hAnsi="Times New Roman" w:cs="Times New Roman"/>
+                <w:lang w:val="tr-TR"/>
+              </w:rPr>
+              <w:t>2.3.</w:t>
+            </w:r>
+          </w:p>
+        </w:tc>
+        <w:tc>
+          <w:tcPr>
+            <w:tcW w:w="5527" w:type="dxa"/>
+            <w:shd w:val="clear" w:color="auto" w:fill="D86DCB" w:themeFill="accent5" w:themeFillTint="99"/>
+          </w:tcPr>
+          <w:p>
+            <w:pPr>
+              <w:jc w:val="both"/>
+              <w:rPr>
+                <w:rFonts w:ascii="Times New Roman" w:hAnsi="Times New Roman" w:cs="Times New Roman"/>
+                <w:lang w:val="tr-TR"/>
+              </w:rPr>
+            </w:pPr>
+            <w:r>
+              <w:rPr>
+                <w:rFonts w:ascii="Times New Roman" w:hAnsi="Times New Roman" w:cs="Times New Roman"/>
+                <w:lang w:val="tr-TR"/>
+              </w:rPr>
+              <w:t xml:space="preserve">Kim11.2.13 / </w:t>
             </w:r>
             <w:proofErr w:type="spellStart"/>
             <w:proofErr w:type="spellEnd"/>

</xml_diff>